<commit_message>
fix: change warehouse id name, add weight unit g, reset password and edit loacation load
</commit_message>
<xml_diff>
--- a/4_Diari/Diario_15_04_26.docx
+++ b/4_Diari/Diario_15_04_26.docx
@@ -116,7 +116,25 @@
               <w:rPr>
                 <w:rFonts w:ascii="Arial" w:hAnsi="Arial" w:cs="Arial"/>
               </w:rPr>
-              <w:t>gg.mm.</w:t>
+              <w:t>15</w:t>
+            </w:r>
+            <w:r>
+              <w:rPr>
+                <w:rFonts w:ascii="Arial" w:hAnsi="Arial" w:cs="Arial"/>
+              </w:rPr>
+              <w:t>.</w:t>
+            </w:r>
+            <w:r>
+              <w:rPr>
+                <w:rFonts w:ascii="Arial" w:hAnsi="Arial" w:cs="Arial"/>
+              </w:rPr>
+              <w:t>04</w:t>
+            </w:r>
+            <w:r>
+              <w:rPr>
+                <w:rFonts w:ascii="Arial" w:hAnsi="Arial" w:cs="Arial"/>
+              </w:rPr>
+              <w:t>.</w:t>
             </w:r>
             <w:r>
               <w:rPr>
@@ -324,6 +342,25 @@
                 <w:rFonts w:ascii="Arial" w:hAnsi="Arial" w:cs="Arial"/>
               </w:rPr>
             </w:pPr>
+            <w:r>
+              <w:rPr>
+                <w:rFonts w:ascii="Arial" w:hAnsi="Arial" w:cs="Arial"/>
+              </w:rPr>
+              <w:t>Anche oggi mi sono dedicato a risolvere alcuni fix tra cui: validazione della mail, alert dialog dele confirmation, validazione sttessa mail, tutti gli admin inattivi, limite alla quantità e ai dati fisici, redirect quando si elimina/disabilita il proprio utente, controllo su il cambio di ruolo solo operator, e alcuni fix grafici. Alcuni di questi fix gli ho notati con l’aiuto del mio collega Andrea Suma.</w:t>
+            </w:r>
+          </w:p>
+          <w:p>
+            <w:pPr>
+              <w:rPr>
+                <w:rFonts w:ascii="Arial" w:hAnsi="Arial" w:cs="Arial"/>
+              </w:rPr>
+            </w:pPr>
+            <w:r>
+              <w:rPr>
+                <w:rFonts w:ascii="Arial" w:hAnsi="Arial" w:cs="Arial"/>
+              </w:rPr>
+              <w:t>Verso la fine della giornata ho iniziato a vedere come fare il forget password e non dovrei metterci tanto. Trovo che sia una funzionalità abbastanza importante perché se un utente dimentica la password non ha modo di recuperarla.</w:t>
+            </w:r>
           </w:p>
         </w:tc>
       </w:tr>
@@ -431,6 +468,12 @@
                 <w:rFonts w:ascii="Arial" w:hAnsi="Arial" w:cs="Arial"/>
               </w:rPr>
             </w:pPr>
+            <w:r>
+              <w:rPr>
+                <w:rFonts w:ascii="Arial" w:hAnsi="Arial" w:cs="Arial"/>
+              </w:rPr>
+              <w:t>In ritardo, a questo punto avrei dovuto iniziare a documentare</w:t>
+            </w:r>
           </w:p>
         </w:tc>
       </w:tr>
@@ -483,6 +526,12 @@
                 <w:rFonts w:ascii="Arial" w:hAnsi="Arial" w:cs="Arial"/>
               </w:rPr>
             </w:pPr>
+            <w:r>
+              <w:rPr>
+                <w:rFonts w:ascii="Arial" w:hAnsi="Arial" w:cs="Arial"/>
+              </w:rPr>
+              <w:t>Fare il forget password e iniziare a documentare.</w:t>
+            </w:r>
           </w:p>
         </w:tc>
       </w:tr>
@@ -551,7 +600,6 @@
             <w14:uncheckedState w14:val="2610" w14:font="MS Gothic"/>
           </w14:checkbox>
         </w:sdtPr>
-        <w:sdtEndPr/>
         <w:sdtContent>
           <w:r>
             <w:rPr>
@@ -582,7 +630,6 @@
             <w14:uncheckedState w14:val="2610" w14:font="MS Gothic"/>
           </w14:checkbox>
         </w:sdtPr>
-        <w:sdtEndPr/>
         <w:sdtContent>
           <w:r>
             <w:rPr>
@@ -608,18 +655,17 @@
           </w:rPr>
           <w:id w:val="-1715336551"/>
           <w14:checkbox>
-            <w14:checked w14:val="0"/>
+            <w14:checked w14:val="1"/>
             <w14:checkedState w14:val="2612" w14:font="MS Gothic"/>
             <w14:uncheckedState w14:val="2610" w14:font="MS Gothic"/>
           </w14:checkbox>
         </w:sdtPr>
-        <w:sdtEndPr/>
         <w:sdtContent>
           <w:r>
             <w:rPr>
-              <w:rFonts w:ascii="MS Gothic" w:eastAsia="MS Gothic" w:hAnsi="MS Gothic" w:cs="Segoe UI Symbol"/>
-            </w:rPr>
-            <w:t>☐</w:t>
+              <w:rFonts w:ascii="MS Gothic" w:eastAsia="MS Gothic" w:hAnsi="MS Gothic" w:cs="Segoe UI Symbol" w:hint="eastAsia"/>
+            </w:rPr>
+            <w:t>☒</w:t>
           </w:r>
         </w:sdtContent>
       </w:sdt>
@@ -685,7 +731,6 @@
           </w:placeholder>
           <w:showingPlcHdr/>
         </w:sdtPr>
-        <w:sdtEndPr/>
         <w:sdtContent>
           <w:r>
             <w:rPr>
@@ -693,25 +738,7 @@
               <w:b/>
               <w:bCs/>
             </w:rPr>
-            <w:t xml:space="preserve">Nomi </w:t>
-          </w:r>
-          <w:proofErr w:type="gramStart"/>
-          <w:r>
-            <w:rPr>
-              <w:rStyle w:val="Testosegnaposto"/>
-              <w:b/>
-              <w:bCs/>
-            </w:rPr>
-            <w:t>AI</w:t>
-          </w:r>
-          <w:proofErr w:type="gramEnd"/>
-          <w:r>
-            <w:rPr>
-              <w:rStyle w:val="Testosegnaposto"/>
-              <w:b/>
-              <w:bCs/>
-            </w:rPr>
-            <w:t xml:space="preserve"> utilizzati</w:t>
+            <w:t>Nomi AI utilizzati</w:t>
           </w:r>
         </w:sdtContent>
       </w:sdt>
@@ -754,7 +781,6 @@
             <w14:uncheckedState w14:val="2610" w14:font="MS Gothic"/>
           </w14:checkbox>
         </w:sdtPr>
-        <w:sdtEndPr/>
         <w:sdtContent>
           <w:r>
             <w:rPr>
@@ -780,18 +806,17 @@
           </w:rPr>
           <w:id w:val="-1631012876"/>
           <w14:checkbox>
-            <w14:checked w14:val="0"/>
+            <w14:checked w14:val="1"/>
             <w14:checkedState w14:val="2612" w14:font="MS Gothic"/>
             <w14:uncheckedState w14:val="2610" w14:font="MS Gothic"/>
           </w14:checkbox>
         </w:sdtPr>
-        <w:sdtEndPr/>
         <w:sdtContent>
           <w:r>
             <w:rPr>
-              <w:rFonts w:ascii="MS Gothic" w:eastAsia="MS Gothic" w:hAnsi="MS Gothic" w:cs="Segoe UI Symbol"/>
-            </w:rPr>
-            <w:t>☐</w:t>
+              <w:rFonts w:ascii="MS Gothic" w:eastAsia="MS Gothic" w:hAnsi="MS Gothic" w:cs="Segoe UI Symbol" w:hint="eastAsia"/>
+            </w:rPr>
+            <w:t>☒</w:t>
           </w:r>
         </w:sdtContent>
       </w:sdt>
@@ -816,7 +841,6 @@
             <w14:uncheckedState w14:val="2610" w14:font="MS Gothic"/>
           </w14:checkbox>
         </w:sdtPr>
-        <w:sdtEndPr/>
         <w:sdtContent>
           <w:r>
             <w:rPr>
@@ -847,7 +871,6 @@
             <w14:uncheckedState w14:val="2610" w14:font="MS Gothic"/>
           </w14:checkbox>
         </w:sdtPr>
-        <w:sdtEndPr/>
         <w:sdtContent>
           <w:r>
             <w:rPr>
@@ -878,7 +901,6 @@
             <w14:uncheckedState w14:val="2610" w14:font="MS Gothic"/>
           </w14:checkbox>
         </w:sdtPr>
-        <w:sdtEndPr/>
         <w:sdtContent>
           <w:r>
             <w:rPr>
@@ -969,25 +991,31 @@
         <w:placeholder>
           <w:docPart w:val="6043C4EFD98A4CC3927C6CBC295759B1"/>
         </w:placeholder>
-        <w:showingPlcHdr/>
         <w15:color w:val="C0C0C0"/>
       </w:sdtPr>
-      <w:sdtEndPr/>
       <w:sdtContent>
         <w:p>
           <w:pPr>
             <w:pStyle w:val="Nessunaspaziatura"/>
-            <w:spacing w:line="276" w:lineRule="auto"/>
-            <w:rPr>
-              <w:rFonts w:ascii="Arial" w:hAnsi="Arial" w:cs="Arial"/>
-            </w:rPr>
-          </w:pPr>
-          <w:r>
-            <w:rPr>
-              <w:rStyle w:val="Testosegnaposto"/>
-            </w:rPr>
-            <w:t>Fare clic o toccare qui per immettere il testo.</w:t>
-          </w:r>
+            <w:rPr>
+              <w:rFonts w:ascii="Arial" w:hAnsi="Arial" w:cs="Arial"/>
+            </w:rPr>
+          </w:pPr>
+          <w:r>
+            <w:rPr>
+              <w:rFonts w:ascii="Arial" w:hAnsi="Arial" w:cs="Arial"/>
+            </w:rPr>
+            <w:t>Aggiungimi l'occhio per la password che hai messo nella pagina di login anche nella paggina degli utenti (adduser) e nella pagina dei settings degli uteni.</w:t>
+          </w:r>
+        </w:p>
+        <w:p>
+          <w:pPr>
+            <w:pStyle w:val="Nessunaspaziatura"/>
+            <w:spacing w:line="276" w:lineRule="auto"/>
+            <w:rPr>
+              <w:rFonts w:ascii="Arial" w:hAnsi="Arial" w:cs="Arial"/>
+            </w:rPr>
+          </w:pPr>
         </w:p>
       </w:sdtContent>
     </w:sdt>
@@ -1057,49 +1085,1225 @@
         <w:placeholder>
           <w:docPart w:val="A99F6FF124534E1D97965DDBA679A1CB"/>
         </w:placeholder>
-        <w:showingPlcHdr/>
         <w15:color w:val="C0C0C0"/>
       </w:sdtPr>
-      <w:sdtEndPr/>
       <w:sdtContent>
         <w:p>
           <w:pPr>
             <w:pStyle w:val="Nessunaspaziatura"/>
-            <w:spacing w:line="276" w:lineRule="auto"/>
-            <w:rPr>
-              <w:rFonts w:ascii="Arial" w:hAnsi="Arial" w:cs="Arial"/>
-            </w:rPr>
-          </w:pPr>
-          <w:r>
-            <w:rPr>
-              <w:rStyle w:val="Testosegnaposto"/>
-            </w:rPr>
-            <w:t xml:space="preserve">Fare clic o toccare qui per </w:t>
-          </w:r>
-          <w:r>
-            <w:rPr>
-              <w:rStyle w:val="Testosegnaposto"/>
-            </w:rPr>
-            <w:t>immet</w:t>
-          </w:r>
-          <w:r>
-            <w:rPr>
-              <w:rStyle w:val="Testosegnaposto"/>
-            </w:rPr>
-            <w:t>t</w:t>
-          </w:r>
-          <w:r>
-            <w:rPr>
-              <w:rStyle w:val="Testosegnaposto"/>
-            </w:rPr>
-            <w:t>ere</w:t>
-          </w:r>
-          <w:r>
-            <w:rPr>
-              <w:rStyle w:val="Testosegnaposto"/>
-            </w:rPr>
-            <w:t xml:space="preserve"> il testo.</w:t>
-          </w:r>
+            <w:rPr>
+              <w:rFonts w:ascii="Arial" w:hAnsi="Arial" w:cs="Arial"/>
+            </w:rPr>
+          </w:pPr>
+          <w:r>
+            <w:rPr>
+              <w:rFonts w:ascii="Arial" w:hAnsi="Arial" w:cs="Arial"/>
+            </w:rPr>
+            <w:t>In UsersPage, aggiorna il DialogForm aggiungendo lo stato e il toggle per il campo password:</w:t>
+          </w:r>
+        </w:p>
+        <w:p>
+          <w:pPr>
+            <w:pStyle w:val="Nessunaspaziatura"/>
+            <w:spacing w:line="276" w:lineRule="auto"/>
+            <w:rPr>
+              <w:rFonts w:ascii="Arial" w:hAnsi="Arial" w:cs="Arial"/>
+            </w:rPr>
+          </w:pPr>
+          <w:r>
+            <w:rPr>
+              <w:rFonts w:ascii="Arial" w:hAnsi="Arial" w:cs="Arial"/>
+            </w:rPr>
+            <w:t>function DialogForm({</w:t>
+          </w:r>
+        </w:p>
+        <w:p>
+          <w:pPr>
+            <w:pStyle w:val="Nessunaspaziatura"/>
+            <w:spacing w:line="276" w:lineRule="auto"/>
+            <w:rPr>
+              <w:rFonts w:ascii="Arial" w:hAnsi="Arial" w:cs="Arial"/>
+            </w:rPr>
+          </w:pPr>
+          <w:r>
+            <w:rPr>
+              <w:rFonts w:ascii="Arial" w:hAnsi="Arial" w:cs="Arial"/>
+            </w:rPr>
+            <w:t xml:space="preserve">  title, onClose, onSubmit, isSubmitting, submitLabel, formData, setFormData, showPassword = false,</w:t>
+          </w:r>
+        </w:p>
+        <w:p>
+          <w:pPr>
+            <w:pStyle w:val="Nessunaspaziatura"/>
+            <w:spacing w:line="276" w:lineRule="auto"/>
+            <w:rPr>
+              <w:rFonts w:ascii="Arial" w:hAnsi="Arial" w:cs="Arial"/>
+            </w:rPr>
+          </w:pPr>
+          <w:r>
+            <w:rPr>
+              <w:rFonts w:ascii="Arial" w:hAnsi="Arial" w:cs="Arial"/>
+            </w:rPr>
+            <w:t>}: {</w:t>
+          </w:r>
+        </w:p>
+        <w:p>
+          <w:pPr>
+            <w:pStyle w:val="Nessunaspaziatura"/>
+            <w:spacing w:line="276" w:lineRule="auto"/>
+            <w:rPr>
+              <w:rFonts w:ascii="Arial" w:hAnsi="Arial" w:cs="Arial"/>
+            </w:rPr>
+          </w:pPr>
+          <w:r>
+            <w:rPr>
+              <w:rFonts w:ascii="Arial" w:hAnsi="Arial" w:cs="Arial"/>
+            </w:rPr>
+            <w:t xml:space="preserve">  title: string;</w:t>
+          </w:r>
+        </w:p>
+        <w:p>
+          <w:pPr>
+            <w:pStyle w:val="Nessunaspaziatura"/>
+            <w:spacing w:line="276" w:lineRule="auto"/>
+            <w:rPr>
+              <w:rFonts w:ascii="Arial" w:hAnsi="Arial" w:cs="Arial"/>
+            </w:rPr>
+          </w:pPr>
+          <w:r>
+            <w:rPr>
+              <w:rFonts w:ascii="Arial" w:hAnsi="Arial" w:cs="Arial"/>
+            </w:rPr>
+            <w:t xml:space="preserve">  onClose: () =&gt; void;</w:t>
+          </w:r>
+        </w:p>
+        <w:p>
+          <w:pPr>
+            <w:pStyle w:val="Nessunaspaziatura"/>
+            <w:spacing w:line="276" w:lineRule="auto"/>
+            <w:rPr>
+              <w:rFonts w:ascii="Arial" w:hAnsi="Arial" w:cs="Arial"/>
+            </w:rPr>
+          </w:pPr>
+          <w:r>
+            <w:rPr>
+              <w:rFonts w:ascii="Arial" w:hAnsi="Arial" w:cs="Arial"/>
+            </w:rPr>
+            <w:t xml:space="preserve">  onSubmit: (e: React.FormEvent) =&gt; void;</w:t>
+          </w:r>
+        </w:p>
+        <w:p>
+          <w:pPr>
+            <w:pStyle w:val="Nessunaspaziatura"/>
+            <w:spacing w:line="276" w:lineRule="auto"/>
+            <w:rPr>
+              <w:rFonts w:ascii="Arial" w:hAnsi="Arial" w:cs="Arial"/>
+            </w:rPr>
+          </w:pPr>
+          <w:r>
+            <w:rPr>
+              <w:rFonts w:ascii="Arial" w:hAnsi="Arial" w:cs="Arial"/>
+            </w:rPr>
+            <w:t xml:space="preserve">  isSubmitting: boolean;</w:t>
+          </w:r>
+        </w:p>
+        <w:p>
+          <w:pPr>
+            <w:pStyle w:val="Nessunaspaziatura"/>
+            <w:spacing w:line="276" w:lineRule="auto"/>
+            <w:rPr>
+              <w:rFonts w:ascii="Arial" w:hAnsi="Arial" w:cs="Arial"/>
+            </w:rPr>
+          </w:pPr>
+          <w:r>
+            <w:rPr>
+              <w:rFonts w:ascii="Arial" w:hAnsi="Arial" w:cs="Arial"/>
+            </w:rPr>
+            <w:t xml:space="preserve">  submitLabel: string;</w:t>
+          </w:r>
+        </w:p>
+        <w:p>
+          <w:pPr>
+            <w:pStyle w:val="Nessunaspaziatura"/>
+            <w:spacing w:line="276" w:lineRule="auto"/>
+            <w:rPr>
+              <w:rFonts w:ascii="Arial" w:hAnsi="Arial" w:cs="Arial"/>
+            </w:rPr>
+          </w:pPr>
+          <w:r>
+            <w:rPr>
+              <w:rFonts w:ascii="Arial" w:hAnsi="Arial" w:cs="Arial"/>
+            </w:rPr>
+            <w:t xml:space="preserve">  formData: FormData;</w:t>
+          </w:r>
+        </w:p>
+        <w:p>
+          <w:pPr>
+            <w:pStyle w:val="Nessunaspaziatura"/>
+            <w:spacing w:line="276" w:lineRule="auto"/>
+            <w:rPr>
+              <w:rFonts w:ascii="Arial" w:hAnsi="Arial" w:cs="Arial"/>
+            </w:rPr>
+          </w:pPr>
+          <w:r>
+            <w:rPr>
+              <w:rFonts w:ascii="Arial" w:hAnsi="Arial" w:cs="Arial"/>
+            </w:rPr>
+            <w:t xml:space="preserve">  setFormData: React.Dispatch&lt;React.SetStateAction&lt;FormData&gt;&gt;;</w:t>
+          </w:r>
+        </w:p>
+        <w:p>
+          <w:pPr>
+            <w:pStyle w:val="Nessunaspaziatura"/>
+            <w:spacing w:line="276" w:lineRule="auto"/>
+            <w:rPr>
+              <w:rFonts w:ascii="Arial" w:hAnsi="Arial" w:cs="Arial"/>
+            </w:rPr>
+          </w:pPr>
+          <w:r>
+            <w:rPr>
+              <w:rFonts w:ascii="Arial" w:hAnsi="Arial" w:cs="Arial"/>
+            </w:rPr>
+            <w:t xml:space="preserve">  showPassword?: boolean;</w:t>
+          </w:r>
+        </w:p>
+        <w:p>
+          <w:pPr>
+            <w:pStyle w:val="Nessunaspaziatura"/>
+            <w:spacing w:line="276" w:lineRule="auto"/>
+            <w:rPr>
+              <w:rFonts w:ascii="Arial" w:hAnsi="Arial" w:cs="Arial"/>
+            </w:rPr>
+          </w:pPr>
+          <w:r>
+            <w:rPr>
+              <w:rFonts w:ascii="Arial" w:hAnsi="Arial" w:cs="Arial"/>
+            </w:rPr>
+            <w:t>}) {</w:t>
+          </w:r>
+        </w:p>
+        <w:p>
+          <w:pPr>
+            <w:pStyle w:val="Nessunaspaziatura"/>
+            <w:spacing w:line="276" w:lineRule="auto"/>
+            <w:rPr>
+              <w:rFonts w:ascii="Arial" w:hAnsi="Arial" w:cs="Arial"/>
+            </w:rPr>
+          </w:pPr>
+          <w:r>
+            <w:rPr>
+              <w:rFonts w:ascii="Arial" w:hAnsi="Arial" w:cs="Arial"/>
+            </w:rPr>
+            <w:t xml:space="preserve">  const [showPasswordVisible, setShowPasswordVisible] = useState(false);</w:t>
+          </w:r>
+        </w:p>
+        <w:p>
+          <w:pPr>
+            <w:pStyle w:val="Nessunaspaziatura"/>
+            <w:spacing w:line="276" w:lineRule="auto"/>
+            <w:rPr>
+              <w:rFonts w:ascii="Arial" w:hAnsi="Arial" w:cs="Arial"/>
+            </w:rPr>
+          </w:pPr>
+        </w:p>
+        <w:p>
+          <w:pPr>
+            <w:pStyle w:val="Nessunaspaziatura"/>
+            <w:spacing w:line="276" w:lineRule="auto"/>
+            <w:rPr>
+              <w:rFonts w:ascii="Arial" w:hAnsi="Arial" w:cs="Arial"/>
+            </w:rPr>
+          </w:pPr>
+          <w:r>
+            <w:rPr>
+              <w:rFonts w:ascii="Arial" w:hAnsi="Arial" w:cs="Arial"/>
+            </w:rPr>
+            <w:t xml:space="preserve">  return (</w:t>
+          </w:r>
+        </w:p>
+        <w:p>
+          <w:pPr>
+            <w:pStyle w:val="Nessunaspaziatura"/>
+            <w:spacing w:line="276" w:lineRule="auto"/>
+            <w:rPr>
+              <w:rFonts w:ascii="Arial" w:hAnsi="Arial" w:cs="Arial"/>
+            </w:rPr>
+          </w:pPr>
+          <w:r>
+            <w:rPr>
+              <w:rFonts w:ascii="Arial" w:hAnsi="Arial" w:cs="Arial"/>
+            </w:rPr>
+            <w:t xml:space="preserve">    // ...</w:t>
+          </w:r>
+        </w:p>
+        <w:p>
+          <w:pPr>
+            <w:pStyle w:val="Nessunaspaziatura"/>
+            <w:spacing w:line="276" w:lineRule="auto"/>
+            <w:rPr>
+              <w:rFonts w:ascii="Arial" w:hAnsi="Arial" w:cs="Arial"/>
+            </w:rPr>
+          </w:pPr>
+          <w:r>
+            <w:rPr>
+              <w:rFonts w:ascii="Arial" w:hAnsi="Arial" w:cs="Arial"/>
+            </w:rPr>
+            <w:t xml:space="preserve">    {showPassword &amp;&amp; (</w:t>
+          </w:r>
+        </w:p>
+        <w:p>
+          <w:pPr>
+            <w:pStyle w:val="Nessunaspaziatura"/>
+            <w:spacing w:line="276" w:lineRule="auto"/>
+            <w:rPr>
+              <w:rFonts w:ascii="Arial" w:hAnsi="Arial" w:cs="Arial"/>
+            </w:rPr>
+          </w:pPr>
+          <w:r>
+            <w:rPr>
+              <w:rFonts w:ascii="Arial" w:hAnsi="Arial" w:cs="Arial"/>
+            </w:rPr>
+            <w:t xml:space="preserve">      &lt;div&gt;</w:t>
+          </w:r>
+        </w:p>
+        <w:p>
+          <w:pPr>
+            <w:pStyle w:val="Nessunaspaziatura"/>
+            <w:spacing w:line="276" w:lineRule="auto"/>
+            <w:rPr>
+              <w:rFonts w:ascii="Arial" w:hAnsi="Arial" w:cs="Arial"/>
+            </w:rPr>
+          </w:pPr>
+          <w:r>
+            <w:rPr>
+              <w:rFonts w:ascii="Arial" w:hAnsi="Arial" w:cs="Arial"/>
+            </w:rPr>
+            <w:t xml:space="preserve">        &lt;label className="block text-sm font-medium text-zinc-300 mb-2"&gt;Password*&lt;/label&gt;</w:t>
+          </w:r>
+        </w:p>
+        <w:p>
+          <w:pPr>
+            <w:pStyle w:val="Nessunaspaziatura"/>
+            <w:spacing w:line="276" w:lineRule="auto"/>
+            <w:rPr>
+              <w:rFonts w:ascii="Arial" w:hAnsi="Arial" w:cs="Arial"/>
+              <w:lang w:val="fr-CH"/>
+            </w:rPr>
+          </w:pPr>
+          <w:r>
+            <w:rPr>
+              <w:rFonts w:ascii="Arial" w:hAnsi="Arial" w:cs="Arial"/>
+            </w:rPr>
+            <w:t xml:space="preserve">        </w:t>
+          </w:r>
+          <w:r>
+            <w:rPr>
+              <w:rFonts w:ascii="Arial" w:hAnsi="Arial" w:cs="Arial"/>
+              <w:lang w:val="fr-CH"/>
+            </w:rPr>
+            <w:t>&lt;div className="relative"&gt;</w:t>
+          </w:r>
+        </w:p>
+        <w:p>
+          <w:pPr>
+            <w:pStyle w:val="Nessunaspaziatura"/>
+            <w:spacing w:line="276" w:lineRule="auto"/>
+            <w:rPr>
+              <w:rFonts w:ascii="Arial" w:hAnsi="Arial" w:cs="Arial"/>
+              <w:lang w:val="fr-CH"/>
+            </w:rPr>
+          </w:pPr>
+          <w:r>
+            <w:rPr>
+              <w:rFonts w:ascii="Arial" w:hAnsi="Arial" w:cs="Arial"/>
+              <w:lang w:val="fr-CH"/>
+            </w:rPr>
+            <w:t xml:space="preserve">          &lt;input</w:t>
+          </w:r>
+        </w:p>
+        <w:p>
+          <w:pPr>
+            <w:pStyle w:val="Nessunaspaziatura"/>
+            <w:spacing w:line="276" w:lineRule="auto"/>
+            <w:rPr>
+              <w:rFonts w:ascii="Arial" w:hAnsi="Arial" w:cs="Arial"/>
+              <w:lang w:val="fr-CH"/>
+            </w:rPr>
+          </w:pPr>
+          <w:r>
+            <w:rPr>
+              <w:rFonts w:ascii="Arial" w:hAnsi="Arial" w:cs="Arial"/>
+              <w:lang w:val="fr-CH"/>
+            </w:rPr>
+            <w:t xml:space="preserve">            type={showPasswordVisible ? "text" : "password"}</w:t>
+          </w:r>
+        </w:p>
+        <w:p>
+          <w:pPr>
+            <w:pStyle w:val="Nessunaspaziatura"/>
+            <w:spacing w:line="276" w:lineRule="auto"/>
+            <w:rPr>
+              <w:rFonts w:ascii="Arial" w:hAnsi="Arial" w:cs="Arial"/>
+              <w:lang w:val="fr-CH"/>
+            </w:rPr>
+          </w:pPr>
+          <w:r>
+            <w:rPr>
+              <w:rFonts w:ascii="Arial" w:hAnsi="Arial" w:cs="Arial"/>
+              <w:lang w:val="fr-CH"/>
+            </w:rPr>
+            <w:t xml:space="preserve">            value={formData.password}</w:t>
+          </w:r>
+        </w:p>
+        <w:p>
+          <w:pPr>
+            <w:pStyle w:val="Nessunaspaziatura"/>
+            <w:spacing w:line="276" w:lineRule="auto"/>
+            <w:rPr>
+              <w:rFonts w:ascii="Arial" w:hAnsi="Arial" w:cs="Arial"/>
+              <w:lang w:val="fr-CH"/>
+            </w:rPr>
+          </w:pPr>
+          <w:r>
+            <w:rPr>
+              <w:rFonts w:ascii="Arial" w:hAnsi="Arial" w:cs="Arial"/>
+              <w:lang w:val="fr-CH"/>
+            </w:rPr>
+            <w:t xml:space="preserve">            onChange={(e) =&gt; setFormData({ ...formData, password: e.target.value })}</w:t>
+          </w:r>
+        </w:p>
+        <w:p>
+          <w:pPr>
+            <w:pStyle w:val="Nessunaspaziatura"/>
+            <w:spacing w:line="276" w:lineRule="auto"/>
+            <w:rPr>
+              <w:rFonts w:ascii="Arial" w:hAnsi="Arial" w:cs="Arial"/>
+              <w:lang w:val="de-CH"/>
+            </w:rPr>
+          </w:pPr>
+          <w:r>
+            <w:rPr>
+              <w:rFonts w:ascii="Arial" w:hAnsi="Arial" w:cs="Arial"/>
+              <w:lang w:val="fr-CH"/>
+            </w:rPr>
+            <w:lastRenderedPageBreak/>
+            <w:t xml:space="preserve">            </w:t>
+          </w:r>
+          <w:r>
+            <w:rPr>
+              <w:rFonts w:ascii="Arial" w:hAnsi="Arial" w:cs="Arial"/>
+              <w:lang w:val="de-CH"/>
+            </w:rPr>
+            <w:t>className={inputCls}</w:t>
+          </w:r>
+        </w:p>
+        <w:p>
+          <w:pPr>
+            <w:pStyle w:val="Nessunaspaziatura"/>
+            <w:spacing w:line="276" w:lineRule="auto"/>
+            <w:rPr>
+              <w:rFonts w:ascii="Arial" w:hAnsi="Arial" w:cs="Arial"/>
+              <w:lang w:val="de-CH"/>
+            </w:rPr>
+          </w:pPr>
+          <w:r>
+            <w:rPr>
+              <w:rFonts w:ascii="Arial" w:hAnsi="Arial" w:cs="Arial"/>
+              <w:lang w:val="de-CH"/>
+            </w:rPr>
+            <w:t xml:space="preserve">            placeholder="Enter password"</w:t>
+          </w:r>
+        </w:p>
+        <w:p>
+          <w:pPr>
+            <w:pStyle w:val="Nessunaspaziatura"/>
+            <w:spacing w:line="276" w:lineRule="auto"/>
+            <w:rPr>
+              <w:rFonts w:ascii="Arial" w:hAnsi="Arial" w:cs="Arial"/>
+              <w:lang w:val="de-CH"/>
+            </w:rPr>
+          </w:pPr>
+          <w:r>
+            <w:rPr>
+              <w:rFonts w:ascii="Arial" w:hAnsi="Arial" w:cs="Arial"/>
+              <w:lang w:val="de-CH"/>
+            </w:rPr>
+            <w:t xml:space="preserve">            required</w:t>
+          </w:r>
+        </w:p>
+        <w:p>
+          <w:pPr>
+            <w:pStyle w:val="Nessunaspaziatura"/>
+            <w:spacing w:line="276" w:lineRule="auto"/>
+            <w:rPr>
+              <w:rFonts w:ascii="Arial" w:hAnsi="Arial" w:cs="Arial"/>
+              <w:lang w:val="de-CH"/>
+            </w:rPr>
+          </w:pPr>
+          <w:r>
+            <w:rPr>
+              <w:rFonts w:ascii="Arial" w:hAnsi="Arial" w:cs="Arial"/>
+              <w:lang w:val="de-CH"/>
+            </w:rPr>
+            <w:t xml:space="preserve">          /&gt;</w:t>
+          </w:r>
+        </w:p>
+        <w:p>
+          <w:pPr>
+            <w:pStyle w:val="Nessunaspaziatura"/>
+            <w:spacing w:line="276" w:lineRule="auto"/>
+            <w:rPr>
+              <w:rFonts w:ascii="Arial" w:hAnsi="Arial" w:cs="Arial"/>
+              <w:lang w:val="de-CH"/>
+            </w:rPr>
+          </w:pPr>
+          <w:r>
+            <w:rPr>
+              <w:rFonts w:ascii="Arial" w:hAnsi="Arial" w:cs="Arial"/>
+              <w:lang w:val="de-CH"/>
+            </w:rPr>
+            <w:t xml:space="preserve">          &lt;button</w:t>
+          </w:r>
+        </w:p>
+        <w:p>
+          <w:pPr>
+            <w:pStyle w:val="Nessunaspaziatura"/>
+            <w:spacing w:line="276" w:lineRule="auto"/>
+            <w:rPr>
+              <w:rFonts w:ascii="Arial" w:hAnsi="Arial" w:cs="Arial"/>
+              <w:lang w:val="de-CH"/>
+            </w:rPr>
+          </w:pPr>
+          <w:r>
+            <w:rPr>
+              <w:rFonts w:ascii="Arial" w:hAnsi="Arial" w:cs="Arial"/>
+              <w:lang w:val="de-CH"/>
+            </w:rPr>
+            <w:t xml:space="preserve">            type="button"</w:t>
+          </w:r>
+        </w:p>
+        <w:p>
+          <w:pPr>
+            <w:pStyle w:val="Nessunaspaziatura"/>
+            <w:spacing w:line="276" w:lineRule="auto"/>
+            <w:rPr>
+              <w:rFonts w:ascii="Arial" w:hAnsi="Arial" w:cs="Arial"/>
+              <w:lang w:val="de-CH"/>
+            </w:rPr>
+          </w:pPr>
+          <w:r>
+            <w:rPr>
+              <w:rFonts w:ascii="Arial" w:hAnsi="Arial" w:cs="Arial"/>
+              <w:lang w:val="de-CH"/>
+            </w:rPr>
+            <w:t xml:space="preserve">            onClick={() =&gt; setShowPasswordVisible(!showPasswordVisible)}</w:t>
+          </w:r>
+        </w:p>
+        <w:p>
+          <w:pPr>
+            <w:pStyle w:val="Nessunaspaziatura"/>
+            <w:spacing w:line="276" w:lineRule="auto"/>
+            <w:rPr>
+              <w:rFonts w:ascii="Arial" w:hAnsi="Arial" w:cs="Arial"/>
+              <w:lang w:val="fr-CH"/>
+            </w:rPr>
+          </w:pPr>
+          <w:r>
+            <w:rPr>
+              <w:rFonts w:ascii="Arial" w:hAnsi="Arial" w:cs="Arial"/>
+              <w:lang w:val="de-CH"/>
+            </w:rPr>
+            <w:t xml:space="preserve">            </w:t>
+          </w:r>
+          <w:r>
+            <w:rPr>
+              <w:rFonts w:ascii="Arial" w:hAnsi="Arial" w:cs="Arial"/>
+              <w:lang w:val="fr-CH"/>
+            </w:rPr>
+            <w:t>className="absolute right-3 top-1/2 -translate-y-1/2 text-zinc-400 hover:text-zinc-300"</w:t>
+          </w:r>
+        </w:p>
+        <w:p>
+          <w:pPr>
+            <w:pStyle w:val="Nessunaspaziatura"/>
+            <w:spacing w:line="276" w:lineRule="auto"/>
+            <w:rPr>
+              <w:rFonts w:ascii="Arial" w:hAnsi="Arial" w:cs="Arial"/>
+              <w:lang w:val="fr-CH"/>
+            </w:rPr>
+          </w:pPr>
+          <w:r>
+            <w:rPr>
+              <w:rFonts w:ascii="Arial" w:hAnsi="Arial" w:cs="Arial"/>
+              <w:lang w:val="fr-CH"/>
+            </w:rPr>
+            <w:t xml:space="preserve">          &gt;</w:t>
+          </w:r>
+        </w:p>
+        <w:p>
+          <w:pPr>
+            <w:pStyle w:val="Nessunaspaziatura"/>
+            <w:spacing w:line="276" w:lineRule="auto"/>
+            <w:rPr>
+              <w:rFonts w:ascii="Arial" w:hAnsi="Arial" w:cs="Arial"/>
+              <w:lang w:val="fr-CH"/>
+            </w:rPr>
+          </w:pPr>
+          <w:r>
+            <w:rPr>
+              <w:rFonts w:ascii="Arial" w:hAnsi="Arial" w:cs="Arial"/>
+              <w:lang w:val="fr-CH"/>
+            </w:rPr>
+            <w:t xml:space="preserve">            {showPasswordVisible ? &lt;EyeOff className="w-5 h-5" /&gt; : &lt;Eye className="w-5 h-5" /&gt;}</w:t>
+          </w:r>
+        </w:p>
+        <w:p>
+          <w:pPr>
+            <w:pStyle w:val="Nessunaspaziatura"/>
+            <w:spacing w:line="276" w:lineRule="auto"/>
+            <w:rPr>
+              <w:rFonts w:ascii="Arial" w:hAnsi="Arial" w:cs="Arial"/>
+            </w:rPr>
+          </w:pPr>
+          <w:r>
+            <w:rPr>
+              <w:rFonts w:ascii="Arial" w:hAnsi="Arial" w:cs="Arial"/>
+              <w:lang w:val="fr-CH"/>
+            </w:rPr>
+            <w:t xml:space="preserve">          </w:t>
+          </w:r>
+          <w:r>
+            <w:rPr>
+              <w:rFonts w:ascii="Arial" w:hAnsi="Arial" w:cs="Arial"/>
+            </w:rPr>
+            <w:t>&lt;/button&gt;</w:t>
+          </w:r>
+        </w:p>
+        <w:p>
+          <w:pPr>
+            <w:pStyle w:val="Nessunaspaziatura"/>
+            <w:spacing w:line="276" w:lineRule="auto"/>
+            <w:rPr>
+              <w:rFonts w:ascii="Arial" w:hAnsi="Arial" w:cs="Arial"/>
+            </w:rPr>
+          </w:pPr>
+          <w:r>
+            <w:rPr>
+              <w:rFonts w:ascii="Arial" w:hAnsi="Arial" w:cs="Arial"/>
+            </w:rPr>
+            <w:t xml:space="preserve">        &lt;/div&gt;</w:t>
+          </w:r>
+        </w:p>
+        <w:p>
+          <w:pPr>
+            <w:pStyle w:val="Nessunaspaziatura"/>
+            <w:spacing w:line="276" w:lineRule="auto"/>
+            <w:rPr>
+              <w:rFonts w:ascii="Arial" w:hAnsi="Arial" w:cs="Arial"/>
+            </w:rPr>
+          </w:pPr>
+          <w:r>
+            <w:rPr>
+              <w:rFonts w:ascii="Arial" w:hAnsi="Arial" w:cs="Arial"/>
+            </w:rPr>
+            <w:t xml:space="preserve">      &lt;/div&gt;</w:t>
+          </w:r>
+        </w:p>
+        <w:p>
+          <w:pPr>
+            <w:pStyle w:val="Nessunaspaziatura"/>
+            <w:spacing w:line="276" w:lineRule="auto"/>
+            <w:rPr>
+              <w:rFonts w:ascii="Arial" w:hAnsi="Arial" w:cs="Arial"/>
+            </w:rPr>
+          </w:pPr>
+          <w:r>
+            <w:rPr>
+              <w:rFonts w:ascii="Arial" w:hAnsi="Arial" w:cs="Arial"/>
+            </w:rPr>
+            <w:t xml:space="preserve">    )}</w:t>
+          </w:r>
+        </w:p>
+        <w:p>
+          <w:pPr>
+            <w:pStyle w:val="Nessunaspaziatura"/>
+            <w:spacing w:line="276" w:lineRule="auto"/>
+            <w:rPr>
+              <w:rFonts w:ascii="Arial" w:hAnsi="Arial" w:cs="Arial"/>
+            </w:rPr>
+          </w:pPr>
+          <w:r>
+            <w:rPr>
+              <w:rFonts w:ascii="Arial" w:hAnsi="Arial" w:cs="Arial"/>
+            </w:rPr>
+            <w:t xml:space="preserve">  );</w:t>
+          </w:r>
+        </w:p>
+        <w:p>
+          <w:pPr>
+            <w:pStyle w:val="Nessunaspaziatura"/>
+            <w:spacing w:line="276" w:lineRule="auto"/>
+            <w:rPr>
+              <w:rFonts w:ascii="Arial" w:hAnsi="Arial" w:cs="Arial"/>
+            </w:rPr>
+          </w:pPr>
+          <w:r>
+            <w:rPr>
+              <w:rFonts w:ascii="Arial" w:hAnsi="Arial" w:cs="Arial"/>
+            </w:rPr>
+            <w:t>}</w:t>
+          </w:r>
+        </w:p>
+        <w:p>
+          <w:pPr>
+            <w:pStyle w:val="Nessunaspaziatura"/>
+            <w:spacing w:line="276" w:lineRule="auto"/>
+            <w:rPr>
+              <w:rFonts w:ascii="Arial" w:hAnsi="Arial" w:cs="Arial"/>
+            </w:rPr>
+          </w:pPr>
+          <w:r>
+            <w:rPr>
+              <w:rFonts w:ascii="Arial" w:hAnsi="Arial" w:cs="Arial"/>
+            </w:rPr>
+            <w:t>Aggiungi Eye, EyeOff agli import di lucide-react.</w:t>
+          </w:r>
+        </w:p>
+        <w:p>
+          <w:pPr>
+            <w:pStyle w:val="Nessunaspaziatura"/>
+            <w:spacing w:line="276" w:lineRule="auto"/>
+            <w:rPr>
+              <w:rFonts w:ascii="Arial" w:hAnsi="Arial" w:cs="Arial"/>
+            </w:rPr>
+          </w:pPr>
+          <w:r>
+            <w:rPr>
+              <w:rFonts w:ascii="Arial" w:hAnsi="Arial" w:cs="Arial"/>
+            </w:rPr>
+            <w:pict w14:anchorId="69F8994B">
+              <v:rect id="_x0000_i1034" style="width:0;height:1.5pt" o:hralign="center" o:hrstd="t" o:hr="t" fillcolor="#a0a0a0" stroked="f"/>
+            </w:pict>
+          </w:r>
+        </w:p>
+        <w:p>
+          <w:pPr>
+            <w:pStyle w:val="Nessunaspaziatura"/>
+            <w:spacing w:line="276" w:lineRule="auto"/>
+            <w:rPr>
+              <w:rFonts w:ascii="Arial" w:hAnsi="Arial" w:cs="Arial"/>
+            </w:rPr>
+          </w:pPr>
+          <w:r>
+            <w:rPr>
+              <w:rFonts w:ascii="Arial" w:hAnsi="Arial" w:cs="Arial"/>
+            </w:rPr>
+            <w:t>In SettingsPage, stesso pattern per entrambi i campi password:</w:t>
+          </w:r>
+        </w:p>
+        <w:p>
+          <w:pPr>
+            <w:pStyle w:val="Nessunaspaziatura"/>
+            <w:spacing w:line="276" w:lineRule="auto"/>
+            <w:rPr>
+              <w:rFonts w:ascii="Arial" w:hAnsi="Arial" w:cs="Arial"/>
+            </w:rPr>
+          </w:pPr>
+          <w:r>
+            <w:rPr>
+              <w:rFonts w:ascii="Arial" w:hAnsi="Arial" w:cs="Arial"/>
+            </w:rPr>
+            <w:t>const [showNew, setShowNew] = useState(false);</w:t>
+          </w:r>
+        </w:p>
+        <w:p>
+          <w:pPr>
+            <w:pStyle w:val="Nessunaspaziatura"/>
+            <w:spacing w:line="276" w:lineRule="auto"/>
+            <w:rPr>
+              <w:rFonts w:ascii="Arial" w:hAnsi="Arial" w:cs="Arial"/>
+            </w:rPr>
+          </w:pPr>
+          <w:r>
+            <w:rPr>
+              <w:rFonts w:ascii="Arial" w:hAnsi="Arial" w:cs="Arial"/>
+            </w:rPr>
+            <w:t>const [showConfirm, setShowConfirm] = useState(false);</w:t>
+          </w:r>
+        </w:p>
+        <w:p>
+          <w:pPr>
+            <w:pStyle w:val="Nessunaspaziatura"/>
+            <w:spacing w:line="276" w:lineRule="auto"/>
+            <w:rPr>
+              <w:rFonts w:ascii="Arial" w:hAnsi="Arial" w:cs="Arial"/>
+            </w:rPr>
+          </w:pPr>
+          <w:r>
+            <w:rPr>
+              <w:rFonts w:ascii="Arial" w:hAnsi="Arial" w:cs="Arial"/>
+            </w:rPr>
+            <w:t>&lt;div className="relative"&gt;</w:t>
+          </w:r>
+        </w:p>
+        <w:p>
+          <w:pPr>
+            <w:pStyle w:val="Nessunaspaziatura"/>
+            <w:spacing w:line="276" w:lineRule="auto"/>
+            <w:rPr>
+              <w:rFonts w:ascii="Arial" w:hAnsi="Arial" w:cs="Arial"/>
+            </w:rPr>
+          </w:pPr>
+          <w:r>
+            <w:rPr>
+              <w:rFonts w:ascii="Arial" w:hAnsi="Arial" w:cs="Arial"/>
+            </w:rPr>
+            <w:t xml:space="preserve">  &lt;input</w:t>
+          </w:r>
+        </w:p>
+        <w:p>
+          <w:pPr>
+            <w:pStyle w:val="Nessunaspaziatura"/>
+            <w:spacing w:line="276" w:lineRule="auto"/>
+            <w:rPr>
+              <w:rFonts w:ascii="Arial" w:hAnsi="Arial" w:cs="Arial"/>
+            </w:rPr>
+          </w:pPr>
+          <w:r>
+            <w:rPr>
+              <w:rFonts w:ascii="Arial" w:hAnsi="Arial" w:cs="Arial"/>
+            </w:rPr>
+            <w:t xml:space="preserve">    type={showNew ? "text" : "password"}</w:t>
+          </w:r>
+        </w:p>
+        <w:p>
+          <w:pPr>
+            <w:pStyle w:val="Nessunaspaziatura"/>
+            <w:spacing w:line="276" w:lineRule="auto"/>
+            <w:rPr>
+              <w:rFonts w:ascii="Arial" w:hAnsi="Arial" w:cs="Arial"/>
+            </w:rPr>
+          </w:pPr>
+          <w:r>
+            <w:rPr>
+              <w:rFonts w:ascii="Arial" w:hAnsi="Arial" w:cs="Arial"/>
+            </w:rPr>
+            <w:t xml:space="preserve">    placeholder="New Password"</w:t>
+          </w:r>
+        </w:p>
+        <w:p>
+          <w:pPr>
+            <w:pStyle w:val="Nessunaspaziatura"/>
+            <w:spacing w:line="276" w:lineRule="auto"/>
+            <w:rPr>
+              <w:rFonts w:ascii="Arial" w:hAnsi="Arial" w:cs="Arial"/>
+            </w:rPr>
+          </w:pPr>
+          <w:r>
+            <w:rPr>
+              <w:rFonts w:ascii="Arial" w:hAnsi="Arial" w:cs="Arial"/>
+            </w:rPr>
+            <w:t xml:space="preserve">    value={passwords.new}</w:t>
+          </w:r>
+        </w:p>
+        <w:p>
+          <w:pPr>
+            <w:pStyle w:val="Nessunaspaziatura"/>
+            <w:spacing w:line="276" w:lineRule="auto"/>
+            <w:rPr>
+              <w:rFonts w:ascii="Arial" w:hAnsi="Arial" w:cs="Arial"/>
+            </w:rPr>
+          </w:pPr>
+          <w:r>
+            <w:rPr>
+              <w:rFonts w:ascii="Arial" w:hAnsi="Arial" w:cs="Arial"/>
+            </w:rPr>
+            <w:t xml:space="preserve">    onChange={e =&gt; setPasswords({ ...passwords, new: e.target.value })}</w:t>
+          </w:r>
+        </w:p>
+        <w:p>
+          <w:pPr>
+            <w:pStyle w:val="Nessunaspaziatura"/>
+            <w:spacing w:line="276" w:lineRule="auto"/>
+            <w:rPr>
+              <w:rFonts w:ascii="Arial" w:hAnsi="Arial" w:cs="Arial"/>
+            </w:rPr>
+          </w:pPr>
+          <w:r>
+            <w:rPr>
+              <w:rFonts w:ascii="Arial" w:hAnsi="Arial" w:cs="Arial"/>
+            </w:rPr>
+            <w:t xml:space="preserve">    className="w-full px-4 py-2 bg-zinc-800 border border-zinc-700 rounded-lg text-white outline-none focus:ring-2 focus:ring-blue-600 pr-10"</w:t>
+          </w:r>
+        </w:p>
+        <w:p>
+          <w:pPr>
+            <w:pStyle w:val="Nessunaspaziatura"/>
+            <w:spacing w:line="276" w:lineRule="auto"/>
+            <w:rPr>
+              <w:rFonts w:ascii="Arial" w:hAnsi="Arial" w:cs="Arial"/>
+            </w:rPr>
+          </w:pPr>
+          <w:r>
+            <w:rPr>
+              <w:rFonts w:ascii="Arial" w:hAnsi="Arial" w:cs="Arial"/>
+            </w:rPr>
+            <w:t xml:space="preserve">  /&gt;</w:t>
+          </w:r>
+        </w:p>
+        <w:p>
+          <w:pPr>
+            <w:pStyle w:val="Nessunaspaziatura"/>
+            <w:spacing w:line="276" w:lineRule="auto"/>
+            <w:rPr>
+              <w:rFonts w:ascii="Arial" w:hAnsi="Arial" w:cs="Arial"/>
+            </w:rPr>
+          </w:pPr>
+          <w:r>
+            <w:rPr>
+              <w:rFonts w:ascii="Arial" w:hAnsi="Arial" w:cs="Arial"/>
+            </w:rPr>
+            <w:t xml:space="preserve">  &lt;button type="button" onClick={() =&gt; setShowNew(!showNew)}</w:t>
+          </w:r>
+        </w:p>
+        <w:p>
+          <w:pPr>
+            <w:pStyle w:val="Nessunaspaziatura"/>
+            <w:spacing w:line="276" w:lineRule="auto"/>
+            <w:rPr>
+              <w:rFonts w:ascii="Arial" w:hAnsi="Arial" w:cs="Arial"/>
+              <w:lang w:val="fr-CH"/>
+            </w:rPr>
+          </w:pPr>
+          <w:r>
+            <w:rPr>
+              <w:rFonts w:ascii="Arial" w:hAnsi="Arial" w:cs="Arial"/>
+            </w:rPr>
+            <w:t xml:space="preserve">    </w:t>
+          </w:r>
+          <w:r>
+            <w:rPr>
+              <w:rFonts w:ascii="Arial" w:hAnsi="Arial" w:cs="Arial"/>
+              <w:lang w:val="fr-CH"/>
+            </w:rPr>
+            <w:t>className="absolute right-3 top-1/2 -translate-y-1/2 text-zinc-400 hover:text-zinc-300"&gt;</w:t>
+          </w:r>
+        </w:p>
+        <w:p>
+          <w:pPr>
+            <w:pStyle w:val="Nessunaspaziatura"/>
+            <w:spacing w:line="276" w:lineRule="auto"/>
+            <w:rPr>
+              <w:rFonts w:ascii="Arial" w:hAnsi="Arial" w:cs="Arial"/>
+              <w:lang w:val="fr-CH"/>
+            </w:rPr>
+          </w:pPr>
+          <w:r>
+            <w:rPr>
+              <w:rFonts w:ascii="Arial" w:hAnsi="Arial" w:cs="Arial"/>
+              <w:lang w:val="fr-CH"/>
+            </w:rPr>
+            <w:t xml:space="preserve">    {showNew ? &lt;EyeOff className="w-5 h-5" /&gt; : &lt;Eye className="w-5 h-5" /&gt;}</w:t>
+          </w:r>
+        </w:p>
+        <w:p>
+          <w:pPr>
+            <w:pStyle w:val="Nessunaspaziatura"/>
+            <w:spacing w:line="276" w:lineRule="auto"/>
+            <w:rPr>
+              <w:rFonts w:ascii="Arial" w:hAnsi="Arial" w:cs="Arial"/>
+            </w:rPr>
+          </w:pPr>
+          <w:r>
+            <w:rPr>
+              <w:rFonts w:ascii="Arial" w:hAnsi="Arial" w:cs="Arial"/>
+              <w:lang w:val="fr-CH"/>
+            </w:rPr>
+            <w:t xml:space="preserve">  </w:t>
+          </w:r>
+          <w:r>
+            <w:rPr>
+              <w:rFonts w:ascii="Arial" w:hAnsi="Arial" w:cs="Arial"/>
+            </w:rPr>
+            <w:t>&lt;/button&gt;</w:t>
+          </w:r>
+        </w:p>
+        <w:p>
+          <w:pPr>
+            <w:pStyle w:val="Nessunaspaziatura"/>
+            <w:spacing w:line="276" w:lineRule="auto"/>
+            <w:rPr>
+              <w:rFonts w:ascii="Arial" w:hAnsi="Arial" w:cs="Arial"/>
+            </w:rPr>
+          </w:pPr>
+          <w:r>
+            <w:rPr>
+              <w:rFonts w:ascii="Arial" w:hAnsi="Arial" w:cs="Arial"/>
+            </w:rPr>
+            <w:t>&lt;/div&gt;</w:t>
+          </w:r>
+        </w:p>
+        <w:p>
+          <w:pPr>
+            <w:pStyle w:val="Nessunaspaziatura"/>
+            <w:spacing w:line="276" w:lineRule="auto"/>
+            <w:rPr>
+              <w:rFonts w:ascii="Arial" w:hAnsi="Arial" w:cs="Arial"/>
+            </w:rPr>
+          </w:pPr>
+        </w:p>
+        <w:p>
+          <w:pPr>
+            <w:pStyle w:val="Nessunaspaziatura"/>
+            <w:spacing w:line="276" w:lineRule="auto"/>
+            <w:rPr>
+              <w:rFonts w:ascii="Arial" w:hAnsi="Arial" w:cs="Arial"/>
+            </w:rPr>
+          </w:pPr>
+          <w:r>
+            <w:rPr>
+              <w:rFonts w:ascii="Arial" w:hAnsi="Arial" w:cs="Arial"/>
+            </w:rPr>
+            <w:t>&lt;div className="relative"&gt;</w:t>
+          </w:r>
+        </w:p>
+        <w:p>
+          <w:pPr>
+            <w:pStyle w:val="Nessunaspaziatura"/>
+            <w:spacing w:line="276" w:lineRule="auto"/>
+            <w:rPr>
+              <w:rFonts w:ascii="Arial" w:hAnsi="Arial" w:cs="Arial"/>
+              <w:lang w:val="fr-CH"/>
+            </w:rPr>
+          </w:pPr>
+          <w:r>
+            <w:rPr>
+              <w:rFonts w:ascii="Arial" w:hAnsi="Arial" w:cs="Arial"/>
+            </w:rPr>
+            <w:t xml:space="preserve">  </w:t>
+          </w:r>
+          <w:r>
+            <w:rPr>
+              <w:rFonts w:ascii="Arial" w:hAnsi="Arial" w:cs="Arial"/>
+              <w:lang w:val="fr-CH"/>
+            </w:rPr>
+            <w:t>&lt;input</w:t>
+          </w:r>
+        </w:p>
+        <w:p>
+          <w:pPr>
+            <w:pStyle w:val="Nessunaspaziatura"/>
+            <w:spacing w:line="276" w:lineRule="auto"/>
+            <w:rPr>
+              <w:rFonts w:ascii="Arial" w:hAnsi="Arial" w:cs="Arial"/>
+              <w:lang w:val="fr-CH"/>
+            </w:rPr>
+          </w:pPr>
+          <w:r>
+            <w:rPr>
+              <w:rFonts w:ascii="Arial" w:hAnsi="Arial" w:cs="Arial"/>
+              <w:lang w:val="fr-CH"/>
+            </w:rPr>
+            <w:t xml:space="preserve">    type={showConfirm ? "text" : "password"}</w:t>
+          </w:r>
+        </w:p>
+        <w:p>
+          <w:pPr>
+            <w:pStyle w:val="Nessunaspaziatura"/>
+            <w:spacing w:line="276" w:lineRule="auto"/>
+            <w:rPr>
+              <w:rFonts w:ascii="Arial" w:hAnsi="Arial" w:cs="Arial"/>
+              <w:lang w:val="fr-CH"/>
+            </w:rPr>
+          </w:pPr>
+          <w:r>
+            <w:rPr>
+              <w:rFonts w:ascii="Arial" w:hAnsi="Arial" w:cs="Arial"/>
+              <w:lang w:val="fr-CH"/>
+            </w:rPr>
+            <w:t xml:space="preserve">    placeholder="Confirm Password"</w:t>
+          </w:r>
+        </w:p>
+        <w:p>
+          <w:pPr>
+            <w:pStyle w:val="Nessunaspaziatura"/>
+            <w:spacing w:line="276" w:lineRule="auto"/>
+            <w:rPr>
+              <w:rFonts w:ascii="Arial" w:hAnsi="Arial" w:cs="Arial"/>
+              <w:lang w:val="fr-CH"/>
+            </w:rPr>
+          </w:pPr>
+          <w:r>
+            <w:rPr>
+              <w:rFonts w:ascii="Arial" w:hAnsi="Arial" w:cs="Arial"/>
+              <w:lang w:val="fr-CH"/>
+            </w:rPr>
+            <w:t xml:space="preserve">    value={passwords.confirm}</w:t>
+          </w:r>
+        </w:p>
+        <w:p>
+          <w:pPr>
+            <w:pStyle w:val="Nessunaspaziatura"/>
+            <w:spacing w:line="276" w:lineRule="auto"/>
+            <w:rPr>
+              <w:rFonts w:ascii="Arial" w:hAnsi="Arial" w:cs="Arial"/>
+              <w:lang w:val="fr-CH"/>
+            </w:rPr>
+          </w:pPr>
+          <w:r>
+            <w:rPr>
+              <w:rFonts w:ascii="Arial" w:hAnsi="Arial" w:cs="Arial"/>
+              <w:lang w:val="fr-CH"/>
+            </w:rPr>
+            <w:t xml:space="preserve">    onChange={e =&gt; setPasswords({ ...passwords, confirm: e.target.value })}</w:t>
+          </w:r>
+        </w:p>
+        <w:p>
+          <w:pPr>
+            <w:pStyle w:val="Nessunaspaziatura"/>
+            <w:spacing w:line="276" w:lineRule="auto"/>
+            <w:rPr>
+              <w:rFonts w:ascii="Arial" w:hAnsi="Arial" w:cs="Arial"/>
+              <w:lang w:val="fr-CH"/>
+            </w:rPr>
+          </w:pPr>
+          <w:r>
+            <w:rPr>
+              <w:rFonts w:ascii="Arial" w:hAnsi="Arial" w:cs="Arial"/>
+              <w:lang w:val="fr-CH"/>
+            </w:rPr>
+            <w:t xml:space="preserve">    className="w-full px-4 py-2 bg-zinc-800 border border-zinc-700 rounded-lg text-white outline-none focus:ring-2 focus:ring-blue-600 pr-10"</w:t>
+          </w:r>
+        </w:p>
+        <w:p>
+          <w:pPr>
+            <w:pStyle w:val="Nessunaspaziatura"/>
+            <w:spacing w:line="276" w:lineRule="auto"/>
+            <w:rPr>
+              <w:rFonts w:ascii="Arial" w:hAnsi="Arial" w:cs="Arial"/>
+              <w:lang w:val="fr-CH"/>
+            </w:rPr>
+          </w:pPr>
+          <w:r>
+            <w:rPr>
+              <w:rFonts w:ascii="Arial" w:hAnsi="Arial" w:cs="Arial"/>
+              <w:lang w:val="fr-CH"/>
+            </w:rPr>
+            <w:t xml:space="preserve">  /&gt;</w:t>
+          </w:r>
+        </w:p>
+        <w:p>
+          <w:pPr>
+            <w:pStyle w:val="Nessunaspaziatura"/>
+            <w:spacing w:line="276" w:lineRule="auto"/>
+            <w:rPr>
+              <w:rFonts w:ascii="Arial" w:hAnsi="Arial" w:cs="Arial"/>
+              <w:lang w:val="fr-CH"/>
+            </w:rPr>
+          </w:pPr>
+          <w:r>
+            <w:rPr>
+              <w:rFonts w:ascii="Arial" w:hAnsi="Arial" w:cs="Arial"/>
+              <w:lang w:val="fr-CH"/>
+            </w:rPr>
+            <w:t xml:space="preserve">  &lt;button type="button" onClick={() =&gt; setShowConfirm(!showConfirm)}</w:t>
+          </w:r>
+        </w:p>
+        <w:p>
+          <w:pPr>
+            <w:pStyle w:val="Nessunaspaziatura"/>
+            <w:spacing w:line="276" w:lineRule="auto"/>
+            <w:rPr>
+              <w:rFonts w:ascii="Arial" w:hAnsi="Arial" w:cs="Arial"/>
+              <w:lang w:val="fr-CH"/>
+            </w:rPr>
+          </w:pPr>
+          <w:r>
+            <w:rPr>
+              <w:rFonts w:ascii="Arial" w:hAnsi="Arial" w:cs="Arial"/>
+              <w:lang w:val="fr-CH"/>
+            </w:rPr>
+            <w:t xml:space="preserve">    className="absolute right-3 top-1/2 -translate-y-1/2 text-zinc-400 hover:text-zinc-300"&gt;</w:t>
+          </w:r>
+        </w:p>
+        <w:p>
+          <w:pPr>
+            <w:pStyle w:val="Nessunaspaziatura"/>
+            <w:spacing w:line="276" w:lineRule="auto"/>
+            <w:rPr>
+              <w:rFonts w:ascii="Arial" w:hAnsi="Arial" w:cs="Arial"/>
+              <w:lang w:val="fr-CH"/>
+            </w:rPr>
+          </w:pPr>
+          <w:r>
+            <w:rPr>
+              <w:rFonts w:ascii="Arial" w:hAnsi="Arial" w:cs="Arial"/>
+              <w:lang w:val="fr-CH"/>
+            </w:rPr>
+            <w:t xml:space="preserve">    {showConfirm ? &lt;EyeOff className="w-5 h-5" /&gt; : &lt;Eye className="w-5 h-5" /&gt;}</w:t>
+          </w:r>
+        </w:p>
+        <w:p>
+          <w:pPr>
+            <w:pStyle w:val="Nessunaspaziatura"/>
+            <w:spacing w:line="276" w:lineRule="auto"/>
+            <w:rPr>
+              <w:rFonts w:ascii="Arial" w:hAnsi="Arial" w:cs="Arial"/>
+            </w:rPr>
+          </w:pPr>
+          <w:r>
+            <w:rPr>
+              <w:rFonts w:ascii="Arial" w:hAnsi="Arial" w:cs="Arial"/>
+              <w:lang w:val="fr-CH"/>
+            </w:rPr>
+            <w:t xml:space="preserve">  </w:t>
+          </w:r>
+          <w:r>
+            <w:rPr>
+              <w:rFonts w:ascii="Arial" w:hAnsi="Arial" w:cs="Arial"/>
+            </w:rPr>
+            <w:t>&lt;/button&gt;</w:t>
+          </w:r>
+        </w:p>
+        <w:p>
+          <w:pPr>
+            <w:pStyle w:val="Nessunaspaziatura"/>
+            <w:spacing w:line="276" w:lineRule="auto"/>
+            <w:rPr>
+              <w:rFonts w:ascii="Arial" w:hAnsi="Arial" w:cs="Arial"/>
+            </w:rPr>
+          </w:pPr>
+          <w:r>
+            <w:rPr>
+              <w:rFonts w:ascii="Arial" w:hAnsi="Arial" w:cs="Arial"/>
+            </w:rPr>
+            <w:t>&lt;/div&gt;</w:t>
+          </w:r>
+        </w:p>
+        <w:p>
+          <w:pPr>
+            <w:pStyle w:val="Nessunaspaziatura"/>
+            <w:spacing w:line="276" w:lineRule="auto"/>
+            <w:rPr>
+              <w:rFonts w:ascii="Arial" w:hAnsi="Arial" w:cs="Arial"/>
+            </w:rPr>
+          </w:pPr>
+          <w:r>
+            <w:rPr>
+              <w:rFonts w:ascii="Arial" w:hAnsi="Arial" w:cs="Arial"/>
+            </w:rPr>
+            <w:lastRenderedPageBreak/>
+            <w:t>Aggiungi Eye, EyeOff anche agli import di SettingsPage.</w:t>
+          </w:r>
+        </w:p>
+        <w:p>
+          <w:pPr>
+            <w:pStyle w:val="Nessunaspaziatura"/>
+            <w:spacing w:line="276" w:lineRule="auto"/>
+            <w:rPr>
+              <w:rFonts w:ascii="Arial" w:hAnsi="Arial" w:cs="Arial"/>
+            </w:rPr>
+          </w:pPr>
         </w:p>
       </w:sdtContent>
     </w:sdt>
@@ -1141,18 +2345,17 @@
           </w:rPr>
           <w:id w:val="-1896963747"/>
           <w14:checkbox>
-            <w14:checked w14:val="0"/>
+            <w14:checked w14:val="1"/>
             <w14:checkedState w14:val="2612" w14:font="MS Gothic"/>
             <w14:uncheckedState w14:val="2610" w14:font="MS Gothic"/>
           </w14:checkbox>
         </w:sdtPr>
-        <w:sdtEndPr/>
         <w:sdtContent>
           <w:r>
             <w:rPr>
               <w:rFonts w:ascii="MS Gothic" w:eastAsia="MS Gothic" w:hAnsi="MS Gothic" w:cs="Segoe UI Symbol" w:hint="eastAsia"/>
             </w:rPr>
-            <w:t>☐</w:t>
+            <w:t>☒</w:t>
           </w:r>
         </w:sdtContent>
       </w:sdt>
@@ -1180,7 +2383,6 @@
             <w14:uncheckedState w14:val="2610" w14:font="MS Gothic"/>
           </w14:checkbox>
         </w:sdtPr>
-        <w:sdtEndPr/>
         <w:sdtContent>
           <w:r>
             <w:rPr>
@@ -1214,7 +2416,6 @@
             <w14:uncheckedState w14:val="2610" w14:font="MS Gothic"/>
           </w14:checkbox>
         </w:sdtPr>
-        <w:sdtEndPr/>
         <w:sdtContent>
           <w:r>
             <w:rPr>
@@ -1248,7 +2449,6 @@
             <w14:uncheckedState w14:val="2610" w14:font="MS Gothic"/>
           </w14:checkbox>
         </w:sdtPr>
-        <w:sdtEndPr/>
         <w:sdtContent>
           <w:r>
             <w:rPr>
@@ -1316,10 +2516,8 @@
         <w:placeholder>
           <w:docPart w:val="A99F6FF124534E1D97965DDBA679A1CB"/>
         </w:placeholder>
-        <w:showingPlcHdr/>
         <w15:color w:val="C0C0C0"/>
       </w:sdtPr>
-      <w:sdtEndPr/>
       <w:sdtContent>
         <w:p>
           <w:pPr>
@@ -1331,21 +2529,9 @@
           </w:pPr>
           <w:r>
             <w:rPr>
-              <w:rStyle w:val="Testosegnaposto"/>
-            </w:rPr>
-            <w:t xml:space="preserve">Fare clic o toccare qui per </w:t>
-          </w:r>
-          <w:r>
-            <w:rPr>
-              <w:rStyle w:val="Testosegnaposto"/>
-            </w:rPr>
-            <w:t>immettere</w:t>
-          </w:r>
-          <w:r>
-            <w:rPr>
-              <w:rStyle w:val="Testosegnaposto"/>
-            </w:rPr>
-            <w:t xml:space="preserve"> il testo.</w:t>
+              <w:rFonts w:ascii="Arial" w:hAnsi="Arial" w:cs="Arial"/>
+            </w:rPr>
+            <w:t>Lo avrei fatto manualmente sprecando tanto tempo</w:t>
           </w:r>
         </w:p>
       </w:sdtContent>
@@ -1415,7 +2601,6 @@
         <w:dataBinding w:prefixMappings="xmlns:ns0='http://schemas.openxmlformats.org/officeDocument/2006/extended-properties'" w:xpath="/ns0:Properties[1]/ns0:Company[1]" w:storeItemID="{6668398D-A668-4E3E-A5EB-62B293D839F1}"/>
         <w:text/>
       </w:sdtPr>
-      <w:sdtEndPr/>
       <w:sdtContent>
         <w:r>
           <w:rPr>
@@ -1574,17 +2759,8 @@
         <w:rFonts w:ascii="Arial" w:hAnsi="Arial" w:cs="Arial"/>
         <w:lang w:val="fr-CH"/>
       </w:rPr>
-      <w:t xml:space="preserve">Christian </w:t>
+      <w:t>Christian Arzani</w:t>
     </w:r>
-    <w:proofErr w:type="spellStart"/>
-    <w:r>
-      <w:rPr>
-        <w:rFonts w:ascii="Arial" w:hAnsi="Arial" w:cs="Arial"/>
-        <w:lang w:val="fr-CH"/>
-      </w:rPr>
-      <w:t>Arzani</w:t>
-    </w:r>
-    <w:proofErr w:type="spellEnd"/>
   </w:p>
 </w:hdr>
 </file>
@@ -4483,7 +5659,6 @@
   <w:style w:type="character" w:default="1" w:styleId="Carpredefinitoparagrafo">
     <w:name w:val="Default Paragraph Font"/>
     <w:uiPriority w:val="1"/>
-    <w:semiHidden/>
     <w:unhideWhenUsed/>
   </w:style>
   <w:style w:type="table" w:default="1" w:styleId="Tabellanormale">
@@ -4960,6 +6135,19 @@
       <w:color w:val="666666"/>
     </w:rPr>
   </w:style>
+  <w:style w:type="paragraph" w:styleId="NormaleWeb">
+    <w:name w:val="Normal (Web)"/>
+    <w:basedOn w:val="Normale"/>
+    <w:uiPriority w:val="99"/>
+    <w:semiHidden/>
+    <w:unhideWhenUsed/>
+    <w:rsid w:val="00A11F53"/>
+    <w:rPr>
+      <w:rFonts w:ascii="Times New Roman" w:hAnsi="Times New Roman" w:cs="Times New Roman"/>
+      <w:sz w:val="24"/>
+      <w:szCs w:val="24"/>
+    </w:rPr>
+  </w:style>
 </w:styles>
 </file>
 
@@ -5198,8 +6386,10 @@
   <w:rsids>
     <w:rsidRoot w:val="00BE72BC"/>
     <w:rsid w:val="003B3A61"/>
+    <w:rsid w:val="003C734E"/>
     <w:rsid w:val="00455C9C"/>
     <w:rsid w:val="0063588A"/>
+    <w:rsid w:val="007010BD"/>
     <w:rsid w:val="007F4556"/>
     <w:rsid w:val="0080736A"/>
     <w:rsid w:val="00BE72BC"/>

</xml_diff>